<commit_message>
Finalize assignment 1.2 document
</commit_message>
<xml_diff>
--- a/module-1/Portillo-GitHub-Repository-Setup.docx
+++ b/module-1/Portillo-GitHub-Repository-Setup.docx
@@ -41,7 +41,7 @@
         <w:t xml:space="preserve">1.2- </w:t>
       </w:r>
       <w:r>
-        <w:t>GitHub Repository Setup, with the assignment number shown in Blackboard</w:t>
+        <w:t>GitHub Repository Setup</w:t>
       </w:r>
     </w:p>
     <w:p>
@@ -120,7 +120,7 @@
           <w:noProof/>
         </w:rPr>
         <w:drawing>
-          <wp:inline distT="0" distB="0" distL="0" distR="0" wp14:anchorId="7B6827C8" wp14:editId="30C71338">
+          <wp:inline distT="0" distB="0" distL="0" distR="0" wp14:anchorId="7B6827C8" wp14:editId="6BA88000">
             <wp:extent cx="5943600" cy="2294255"/>
             <wp:effectExtent l="0" t="0" r="0" b="4445"/>
             <wp:docPr id="1391627274" name="Picture 2"/>

</xml_diff>